<commit_message>
updated manual, updated semester
</commit_message>
<xml_diff>
--- a/docs/SATP_USER_MANUAL.docx
+++ b/docs/SATP_USER_MANUAL.docx
@@ -37,7 +37,7 @@
       </w:pPr>
       <w:r>
         <w:rPr/>
-        <w:t xml:space="preserve">Version: August 15, 2026</w:t>
+        <w:t xml:space="preserve">Version: August 17, 2026</w:t>
       </w:r>
     </w:p>
     <w:p/>
@@ -609,6 +609,16 @@
     <w:p/>
     <w:p>
       <w:pPr>
+        <w:pStyle w:val="Normal"/>
+      </w:pPr>
+      <w:r>
+        <w:rPr/>
+        <w:t xml:space="preserve">For administrator accounts, SATP automatically selects and filters the page according to the account's academic scope. College scope loads the current College term and shows only College students. SHS scope loads the current SHS term and shows only SHS students. All defaults to the current College term but permits both College and SHS data. The same restriction applies to the transaction table, dashboard totals, student course details, and pending-transaction workbook export.</w:t>
+      </w:r>
+    </w:p>
+    <w:p/>
+    <w:p>
+      <w:pPr>
         <w:pStyle w:val="ListParagraph"/>
       </w:pPr>
       <w:r>
@@ -1193,6 +1203,16 @@
     <w:p/>
     <w:p>
       <w:pPr>
+        <w:pStyle w:val="Normal"/>
+      </w:pPr>
+      <w:r>
+        <w:rPr/>
+        <w:t xml:space="preserve">Administrator academic scope controls the initial period and visible student data in Student Course and Schedule assignment. College administrators see College records, SHS administrators see SHS records, and administrators with All scope see both groups. Scope is enforced by the server and is not only a visual table filter.</w:t>
+      </w:r>
+    </w:p>
+    <w:p/>
+    <w:p>
+      <w:pPr>
         <w:pStyle w:val="Heading2"/>
       </w:pPr>
       <w:r>
@@ -1314,25 +1334,174 @@
       </w:pPr>
       <w:r>
         <w:rPr/>
-        <w:t xml:space="preserve">6. Set the temporary-password and active-account options as required.</w:t>
-      </w:r>
-    </w:p>
-    <w:p>
-      <w:pPr>
-        <w:pStyle w:val="ListParagraph"/>
-      </w:pPr>
-      <w:r>
-        <w:rPr/>
-        <w:t xml:space="preserve">7. For a new account, provide either a temporary password, an institutional email, or both.</w:t>
-      </w:r>
-    </w:p>
-    <w:p>
-      <w:pPr>
-        <w:pStyle w:val="ListParagraph"/>
-      </w:pPr>
-      <w:r>
-        <w:rPr/>
-        <w:t xml:space="preserve">8. Save and confirm the username and institutional email appear correctly in the directory.</w:t>
+        <w:t xml:space="preserve">6. Select the academic scope: College, Senior High School, or All academic groups.</w:t>
+      </w:r>
+    </w:p>
+    <w:p>
+      <w:pPr>
+        <w:pStyle w:val="ListParagraph"/>
+      </w:pPr>
+      <w:r>
+        <w:rPr/>
+        <w:t xml:space="preserve">7. Set the temporary-password and active-account options as required.</w:t>
+      </w:r>
+    </w:p>
+    <w:p>
+      <w:pPr>
+        <w:pStyle w:val="ListParagraph"/>
+      </w:pPr>
+      <w:r>
+        <w:rPr/>
+        <w:t xml:space="preserve">8. For a new account, provide either a temporary password, an institutional email, or both.</w:t>
+      </w:r>
+    </w:p>
+    <w:p>
+      <w:pPr>
+        <w:pStyle w:val="ListParagraph"/>
+      </w:pPr>
+      <w:r>
+        <w:rPr/>
+        <w:t xml:space="preserve">9. Save and confirm the username and institutional email appear correctly in the directory.</w:t>
+      </w:r>
+    </w:p>
+    <w:p/>
+    <w:p>
+      <w:pPr>
+        <w:pStyle w:val="Normal"/>
+      </w:pPr>
+      <w:r>
+        <w:rPr/>
+        <w:t xml:space="preserve">Academic scope determines the default semester and visible student records in Transactions, Student Course, and Schedule assignment:</w:t>
+      </w:r>
+    </w:p>
+    <w:p/>
+    <w:p>
+      <w:pPr>
+        <w:pStyle w:val="ListParagraph"/>
+      </w:pPr>
+      <w:r>
+        <w:rPr/>
+        <w:t xml:space="preserve">• College uses the current College term and College students.</w:t>
+      </w:r>
+    </w:p>
+    <w:p>
+      <w:pPr>
+        <w:pStyle w:val="ListParagraph"/>
+      </w:pPr>
+      <w:r>
+        <w:rPr/>
+        <w:t xml:space="preserve">• Senior High School uses the current SHS term and SHS students.</w:t>
+      </w:r>
+    </w:p>
+    <w:p>
+      <w:pPr>
+        <w:pStyle w:val="ListParagraph"/>
+      </w:pPr>
+      <w:r>
+        <w:rPr/>
+        <w:t xml:space="preserve">• All academic groups defaults to the current College term and permits both groups.</w:t>
+      </w:r>
+    </w:p>
+    <w:p/>
+    <w:p>
+      <w:pPr>
+        <w:pStyle w:val="Normal"/>
+      </w:pPr>
+      <w:r>
+        <w:rPr/>
+        <w:t xml:space="preserve">To import administrator accounts:</w:t>
+      </w:r>
+    </w:p>
+    <w:p/>
+    <w:p>
+      <w:pPr>
+        <w:pStyle w:val="ListParagraph"/>
+      </w:pPr>
+      <w:r>
+        <w:rPr/>
+        <w:t xml:space="preserve">1. Select Import admins.</w:t>
+      </w:r>
+    </w:p>
+    <w:p>
+      <w:pPr>
+        <w:pStyle w:val="ListParagraph"/>
+      </w:pPr>
+      <w:r>
+        <w:rPr/>
+        <w:t xml:space="preserve">2. Download the template when preparing a new workbook.</w:t>
+      </w:r>
+    </w:p>
+    <w:p>
+      <w:pPr>
+        <w:pStyle w:val="ListParagraph"/>
+      </w:pPr>
+      <w:r>
+        <w:rPr/>
+        <w:t xml:space="preserve">3. Supply `username`, `givenname`, `surname`, `gender`, and `permission_id` for every row.</w:t>
+      </w:r>
+    </w:p>
+    <w:p>
+      <w:pPr>
+        <w:pStyle w:val="ListParagraph"/>
+      </w:pPr>
+      <w:r>
+        <w:rPr/>
+        <w:t xml:space="preserve">4. Optionally supply `password`, `middlename`, `google_email`, `admin_academic_scope`, and `is_active`.</w:t>
+      </w:r>
+    </w:p>
+    <w:p>
+      <w:pPr>
+        <w:pStyle w:val="ListParagraph"/>
+      </w:pPr>
+      <w:r>
+        <w:rPr/>
+        <w:t xml:space="preserve">5. Use `COLLEGE`, `SHS`, or `ALL` for `admin_academic_scope`. A blank scope defaults to `ALL`.</w:t>
+      </w:r>
+    </w:p>
+    <w:p>
+      <w:pPr>
+        <w:pStyle w:val="ListParagraph"/>
+      </w:pPr>
+      <w:r>
+        <w:rPr/>
+        <w:t xml:space="preserve">6. Select the workbook and choose Validate file.</w:t>
+      </w:r>
+    </w:p>
+    <w:p>
+      <w:pPr>
+        <w:pStyle w:val="ListParagraph"/>
+      </w:pPr>
+      <w:r>
+        <w:rPr/>
+        <w:t xml:space="preserve">7. Review the Created, Updated, Unchanged, and Errors sections.</w:t>
+      </w:r>
+    </w:p>
+    <w:p>
+      <w:pPr>
+        <w:pStyle w:val="ListParagraph"/>
+      </w:pPr>
+      <w:r>
+        <w:rPr/>
+        <w:t xml:space="preserve">8. Select Run import and keep the page open until processing finishes.</w:t>
+      </w:r>
+    </w:p>
+    <w:p>
+      <w:pPr>
+        <w:pStyle w:val="ListParagraph"/>
+      </w:pPr>
+      <w:r>
+        <w:rPr/>
+        <w:t xml:space="preserve">9. If errors are detected, open the downloaded error workbook, correct the indicated rows, and upload it again.</w:t>
+      </w:r>
+    </w:p>
+    <w:p/>
+    <w:p>
+      <w:pPr>
+        <w:pStyle w:val="Normal"/>
+      </w:pPr>
+      <w:r>
+        <w:rPr/>
+        <w:t xml:space="preserve">Admin imports match existing accounts by username. They create missing administrators, update changed profile, permission, scope, email, and status values, and skip unchanged accounts. Active permissions are accepted except Rater, which is reserved for student accounts. A regular admin import never replaces an existing password, even when the workbook contains a password; the password is only used when creating a new account.</w:t>
       </w:r>
     </w:p>
     <w:p/>
@@ -2339,6 +2508,16 @@
     <w:p/>
     <w:p>
       <w:pPr>
+        <w:pStyle w:val="Normal"/>
+      </w:pPr>
+      <w:r>
+        <w:rPr/>
+        <w:t xml:space="preserve">For an administrator with All academic groups scope, Transactions, Student Course, and Schedule assignment default to the current College term. The administrator may manually select another available period afterward.</w:t>
+      </w:r>
+    </w:p>
+    <w:p/>
+    <w:p>
+      <w:pPr>
         <w:pStyle w:val="Heading2"/>
       </w:pPr>
       <w:r>
@@ -2579,6 +2758,16 @@
       </w:pPr>
       <w:r>
         <w:rPr/>
+        <w:t xml:space="preserve">The student directory and the student list inside Add student course follow the signed-in administrator's academic scope. SHS scope shows only students whose Program belongs to the SHS Department; College scope shows students from other Departments; All scope shows both. Included and excluded course counts and detail records use the same server-side restriction.</w:t>
+      </w:r>
+    </w:p>
+    <w:p/>
+    <w:p>
+      <w:pPr>
+        <w:pStyle w:val="Normal"/>
+      </w:pPr>
+      <w:r>
+        <w:rPr/>
         <w:t xml:space="preserve">To add an enrollment manually:</w:t>
       </w:r>
     </w:p>
@@ -2899,6 +3088,16 @@
     <w:p/>
     <w:p>
       <w:pPr>
+        <w:pStyle w:val="Normal"/>
+      </w:pPr>
+      <w:r>
+        <w:rPr/>
+        <w:t xml:space="preserve">Schedule rows and student counts follow the signed-in administrator's academic scope. The system identifies the group through each enrolled student's Program and Department: Department code SHS is treated as SHS, and other Department codes are treated as College. Reassign, Dissolve, and Restore requests are restricted by the same rule, including direct API requests.</w:t>
+      </w:r>
+    </w:p>
+    <w:p/>
+    <w:p>
+      <w:pPr>
         <w:pStyle w:val="ListParagraph"/>
       </w:pPr>
       <w:r>
@@ -3941,7 +4140,27 @@
       </w:pPr>
       <w:r>
         <w:rPr/>
+        <w:t xml:space="preserve">Select the account type before selecting a permission. Student accounts automatically use Rater and cannot select an administrator permission. Admin accounts can select any active permission except Rater. Admin accounts also require an academic scope of College, SHS, or All. The account-type and permission rules are also checked during workbook validation.</w:t>
+      </w:r>
+    </w:p>
+    <w:p/>
+    <w:p>
+      <w:pPr>
+        <w:pStyle w:val="Normal"/>
+      </w:pPr>
+      <w:r>
+        <w:rPr/>
         <w:t xml:space="preserve">Use Import users for account creation and profile updates. Existing passwords are always retained. Use Update passwords only for intentional password changes. Use the username-based deactivation workbook to deactivate multiple accounts.</w:t>
+      </w:r>
+    </w:p>
+    <w:p/>
+    <w:p>
+      <w:pPr>
+        <w:pStyle w:val="Normal"/>
+      </w:pPr>
+      <w:r>
+        <w:rPr/>
+        <w:t xml:space="preserve">For User Management imports, the optional admin_academic_scope column accepts COLLEGE, SHS, or ALL. A blank scope for an admin defaults to ALL; student rows always store no administrator scope.</w:t>
       </w:r>
     </w:p>
     <w:p/>

</xml_diff>